<commit_message>
Add 1NF-2NF-3NF normalization analysis to report (PDF/DOCX/MD)
</commit_message>
<xml_diff>
--- a/report.docx
+++ b/report.docx
@@ -10,7 +10,7 @@
         <w:rPr>
           <w:b/>
           <w:color w:val="1F3864"/>
-          <w:sz w:val="32"/>
+          <w:sz w:val="30"/>
         </w:rPr>
         <w:t>STREAMFLIX — Dizi &amp; Film İzleme Platformu Veritabanı Sistemi</w:t>
       </w:r>
@@ -22,9 +22,9 @@
       <w:r>
         <w:rPr>
           <w:i/>
-          <w:sz w:val="22"/>
+          <w:sz w:val="21"/>
         </w:rPr>
-        <w:t>Veritabanı Sistemleri Dönem Projesi</w:t>
+        <w:t>Veritabanı Sistemleri (COMP2004) Dönem Projesi</w:t>
       </w:r>
     </w:p>
     <w:p>
@@ -33,7 +33,7 @@
       </w:pPr>
       <w:r>
         <w:rPr>
-          <w:sz w:val="20"/>
+          <w:sz w:val="19"/>
         </w:rPr>
         <w:t>Grup Üyeleri: Göktuğ Karaca, Defne Kaya   ·   Tarih: 29.05.2026</w:t>
       </w:r>
@@ -41,28 +41,31 @@
     <w:p>
       <w:pPr>
         <w:pStyle w:val="Heading1"/>
+        <w:spacing w:before="80" w:after="40"/>
       </w:pPr>
       <w:r>
         <w:rPr>
           <w:color w:val="1F3864"/>
-          <w:sz w:val="26"/>
+          <w:sz w:val="25"/>
         </w:rPr>
         <w:t>1. Sistem Tanımı ve Fonksiyonel Gereksinimler</w:t>
       </w:r>
     </w:p>
     <w:p>
+      <w:pPr>
+        <w:spacing w:after="40"/>
+      </w:pPr>
       <w:r>
-        <w:t>STREAMFLIX, kullanıcıların film ve dizi izleyebildiği, kişisel hesaplarıyla giriş yaparak içerikleri izleme listesine ekleyebildiği, favorileyebildiği, puanlayıp yorum yapabildiği bir dijital içerik yayın (streaming) platformudur. Netflix benzeri bir sistemin veri katmanını modeller; web/mobil arayüz kapsam dışıdır, odak ilişkisel veritabanı tasarımıdır.</w:t>
-      </w:r>
-    </w:p>
-    <w:p>
-      <w:r>
-        <w:t>Başlıca fonksiyonel gereksinimler:</w:t>
+        <w:rPr>
+          <w:sz w:val="20"/>
+        </w:rPr>
+        <w:t>STREAMFLIX, kullanıcıların film ve dizi izleyebildiği, kişisel hesaplarıyla giriş yaparak içerikleri izleme listesine ekleyebildiği, favorileyebildiği, puanlayıp yorum yapabildiği bir dijital içerik yayın (streaming) platformudur. Netflix benzeri bir sistemin veri katmanını modeller; web/mobil arayüz kapsam dışıdır, odak ilişkisel veritabanı tasarımıdır. Başlıca fonksiyonel gereksinimler:</w:t>
       </w:r>
     </w:p>
     <w:p>
       <w:pPr>
         <w:pStyle w:val="ListBullet"/>
+        <w:spacing w:after="20"/>
       </w:pPr>
       <w:r>
         <w:t>Kullanıcılar kişisel bilgileriyle (e-posta, ad, ülke, doğum tarihi) kayıt olur ve giriş yapar.</w:t>
@@ -71,6 +74,7 @@
     <w:p>
       <w:pPr>
         <w:pStyle w:val="ListBullet"/>
+        <w:spacing w:after="20"/>
       </w:pPr>
       <w:r>
         <w:t>Bir hesap altında birden fazla profil (yetişkin / çocuk) bulunabilir.</w:t>
@@ -79,14 +83,16 @@
     <w:p>
       <w:pPr>
         <w:pStyle w:val="ListBullet"/>
+        <w:spacing w:after="20"/>
       </w:pPr>
       <w:r>
-        <w:t>Kullanıcılar üç abonelik planından (Basic / Standard / Premium) birine abone olur ve aylık ödeme yapar.</w:t>
+        <w:t>Kullanıcılar üç abonelik planından (Basic/Standard/Premium) birine abone olur ve aylık ödeme yapar.</w:t>
       </w:r>
     </w:p>
     <w:p>
       <w:pPr>
         <w:pStyle w:val="ListBullet"/>
+        <w:spacing w:after="20"/>
       </w:pPr>
       <w:r>
         <w:t>İçerikler film veya dizi olabilir; diziler sezon ve bölümlere ayrılır.</w:t>
@@ -95,22 +101,25 @@
     <w:p>
       <w:pPr>
         <w:pStyle w:val="ListBullet"/>
+        <w:spacing w:after="20"/>
       </w:pPr>
       <w:r>
-        <w:t>Her içeriğin birden çok türü (Action, Drama…) ve oyuncu/yönetmen kadrosu vardır.</w:t>
+        <w:t>Her içeriğin birden çok türü ve oyuncu/yönetmen kadrosu vardır.</w:t>
       </w:r>
     </w:p>
     <w:p>
       <w:pPr>
         <w:pStyle w:val="ListBullet"/>
+        <w:spacing w:after="20"/>
       </w:pPr>
       <w:r>
-        <w:t>Profiller içeriği izleme listesine ve favorilere ekler; izleme geçmişi tutulur; puan ve yorum yazılır.</w:t>
+        <w:t>Profiller içeriği izleme listesine/favorilere ekler; izleme geçmişi tutulur; puan ve yorum yazılır.</w:t>
       </w:r>
     </w:p>
     <w:p>
       <w:pPr>
         <w:pStyle w:val="ListBullet"/>
+        <w:spacing w:after="20"/>
       </w:pPr>
       <w:r>
         <w:t>İçeriklerin altyazı dilleri ve kullanıcıların cihazları kaydedilir.</w:t>
@@ -119,18 +128,25 @@
     <w:p>
       <w:pPr>
         <w:pStyle w:val="Heading1"/>
+        <w:spacing w:before="80" w:after="40"/>
       </w:pPr>
       <w:r>
         <w:rPr>
           <w:color w:val="1F3864"/>
-          <w:sz w:val="26"/>
+          <w:sz w:val="25"/>
         </w:rPr>
-        <w:t>2. Mantıksal Tasarım (E-R Diyagramı)</w:t>
+        <w:t>2. Mantıksal Tasarım (E-R Modeli)</w:t>
       </w:r>
     </w:p>
     <w:p>
+      <w:pPr>
+        <w:spacing w:after="40"/>
+      </w:pPr>
       <w:r>
-        <w:t>Sistem 22 normalize tablo içerir (3NF). Tüm tablo, anahtar, kardinalite ve ilişkiler schema.dbml dosyasında tanımlıdır ve dbdiagram.io üzerinde görsel E-R diyagramı olarak üretilir. Başlıca varlıklar ve ilişkiler:</w:t>
+        <w:rPr>
+          <w:sz w:val="20"/>
+        </w:rPr>
+        <w:t>Sistem 22 normalize tablo içerir. Tüm tablo, anahtar, kardinalite ve ilişkiler schema.dbml dosyasında tanımlıdır ve dbdiagram.io üzerinde görsel E-R diyagramı olarak üretilir. Başlıca ilişkiler:</w:t>
       </w:r>
     </w:p>
     <w:tbl>
@@ -140,19 +156,20 @@
         <w:tblLook w:firstColumn="1" w:firstRow="1" w:lastColumn="0" w:lastRow="0" w:noHBand="0" w:noVBand="1" w:val="04A0"/>
       </w:tblPr>
       <w:tblGrid>
-        <w:gridCol w:w="3312"/>
-        <w:gridCol w:w="3312"/>
-        <w:gridCol w:w="3312"/>
+        <w:gridCol w:w="3408"/>
+        <w:gridCol w:w="3408"/>
+        <w:gridCol w:w="3408"/>
       </w:tblGrid>
       <w:tr>
         <w:tc>
           <w:tcPr>
-            <w:tcW w:type="dxa" w:w="3312"/>
+            <w:tcW w:type="dxa" w:w="3408"/>
           </w:tcPr>
           <w:p>
             <w:r>
               <w:rPr>
                 <w:b/>
+                <w:sz w:val="18"/>
               </w:rPr>
               <w:t>İlişki</w:t>
             </w:r>
@@ -160,12 +177,13 @@
         </w:tc>
         <w:tc>
           <w:tcPr>
-            <w:tcW w:type="dxa" w:w="3312"/>
+            <w:tcW w:type="dxa" w:w="3408"/>
           </w:tcPr>
           <w:p>
             <w:r>
               <w:rPr>
                 <w:b/>
+                <w:sz w:val="18"/>
               </w:rPr>
               <w:t>Kardinalite</w:t>
             </w:r>
@@ -173,12 +191,13 @@
         </w:tc>
         <w:tc>
           <w:tcPr>
-            <w:tcW w:type="dxa" w:w="3312"/>
+            <w:tcW w:type="dxa" w:w="3408"/>
           </w:tcPr>
           <w:p>
             <w:r>
               <w:rPr>
                 <w:b/>
+                <w:sz w:val="18"/>
               </w:rPr>
               <w:t>Açıklama</w:t>
             </w:r>
@@ -188,30 +207,39 @@
       <w:tr>
         <w:tc>
           <w:tcPr>
-            <w:tcW w:type="dxa" w:w="3312"/>
+            <w:tcW w:type="dxa" w:w="3408"/>
           </w:tcPr>
           <w:p>
             <w:r>
+              <w:rPr>
+                <w:sz w:val="18"/>
+              </w:rPr>
               <w:t>users — profiles</w:t>
             </w:r>
           </w:p>
         </w:tc>
         <w:tc>
           <w:tcPr>
-            <w:tcW w:type="dxa" w:w="3312"/>
+            <w:tcW w:type="dxa" w:w="3408"/>
           </w:tcPr>
           <w:p>
             <w:r>
+              <w:rPr>
+                <w:sz w:val="18"/>
+              </w:rPr>
               <w:t>1 : N</w:t>
             </w:r>
           </w:p>
         </w:tc>
         <w:tc>
           <w:tcPr>
-            <w:tcW w:type="dxa" w:w="3312"/>
+            <w:tcW w:type="dxa" w:w="3408"/>
           </w:tcPr>
           <w:p>
             <w:r>
+              <w:rPr>
+                <w:sz w:val="18"/>
+              </w:rPr>
               <w:t>Bir hesap birçok profile sahip</w:t>
             </w:r>
           </w:p>
@@ -220,30 +248,39 @@
       <w:tr>
         <w:tc>
           <w:tcPr>
-            <w:tcW w:type="dxa" w:w="3312"/>
+            <w:tcW w:type="dxa" w:w="3408"/>
           </w:tcPr>
           <w:p>
             <w:r>
+              <w:rPr>
+                <w:sz w:val="18"/>
+              </w:rPr>
               <w:t>users — subscriptions — payments</w:t>
             </w:r>
           </w:p>
         </w:tc>
         <w:tc>
           <w:tcPr>
-            <w:tcW w:type="dxa" w:w="3312"/>
+            <w:tcW w:type="dxa" w:w="3408"/>
           </w:tcPr>
           <w:p>
             <w:r>
+              <w:rPr>
+                <w:sz w:val="18"/>
+              </w:rPr>
               <w:t>1 : N : N</w:t>
             </w:r>
           </w:p>
         </w:tc>
         <w:tc>
           <w:tcPr>
-            <w:tcW w:type="dxa" w:w="3312"/>
+            <w:tcW w:type="dxa" w:w="3408"/>
           </w:tcPr>
           <w:p>
             <w:r>
+              <w:rPr>
+                <w:sz w:val="18"/>
+              </w:rPr>
               <w:t>Abonelik ve ödeme zinciri</w:t>
             </w:r>
           </w:p>
@@ -252,30 +289,39 @@
       <w:tr>
         <w:tc>
           <w:tcPr>
-            <w:tcW w:type="dxa" w:w="3312"/>
+            <w:tcW w:type="dxa" w:w="3408"/>
           </w:tcPr>
           <w:p>
             <w:r>
+              <w:rPr>
+                <w:sz w:val="18"/>
+              </w:rPr>
               <w:t>content — movies / series</w:t>
             </w:r>
           </w:p>
         </w:tc>
         <w:tc>
           <w:tcPr>
-            <w:tcW w:type="dxa" w:w="3312"/>
+            <w:tcW w:type="dxa" w:w="3408"/>
           </w:tcPr>
           <w:p>
             <w:r>
+              <w:rPr>
+                <w:sz w:val="18"/>
+              </w:rPr>
               <w:t>1 : 1</w:t>
             </w:r>
           </w:p>
         </w:tc>
         <w:tc>
           <w:tcPr>
-            <w:tcW w:type="dxa" w:w="3312"/>
+            <w:tcW w:type="dxa" w:w="3408"/>
           </w:tcPr>
           <w:p>
             <w:r>
+              <w:rPr>
+                <w:sz w:val="18"/>
+              </w:rPr>
               <w:t>Üst tip / alt tip (ISA) ayrımı</w:t>
             </w:r>
           </w:p>
@@ -284,30 +330,39 @@
       <w:tr>
         <w:tc>
           <w:tcPr>
-            <w:tcW w:type="dxa" w:w="3312"/>
+            <w:tcW w:type="dxa" w:w="3408"/>
           </w:tcPr>
           <w:p>
             <w:r>
+              <w:rPr>
+                <w:sz w:val="18"/>
+              </w:rPr>
               <w:t>series — seasons — episodes</w:t>
             </w:r>
           </w:p>
         </w:tc>
         <w:tc>
           <w:tcPr>
-            <w:tcW w:type="dxa" w:w="3312"/>
+            <w:tcW w:type="dxa" w:w="3408"/>
           </w:tcPr>
           <w:p>
             <w:r>
+              <w:rPr>
+                <w:sz w:val="18"/>
+              </w:rPr>
               <w:t>1 : N : N</w:t>
             </w:r>
           </w:p>
         </w:tc>
         <w:tc>
           <w:tcPr>
-            <w:tcW w:type="dxa" w:w="3312"/>
+            <w:tcW w:type="dxa" w:w="3408"/>
           </w:tcPr>
           <w:p>
             <w:r>
+              <w:rPr>
+                <w:sz w:val="18"/>
+              </w:rPr>
               <w:t>Dizi hiyerarşisi</w:t>
             </w:r>
           </w:p>
@@ -316,30 +371,39 @@
       <w:tr>
         <w:tc>
           <w:tcPr>
-            <w:tcW w:type="dxa" w:w="3312"/>
+            <w:tcW w:type="dxa" w:w="3408"/>
           </w:tcPr>
           <w:p>
             <w:r>
+              <w:rPr>
+                <w:sz w:val="18"/>
+              </w:rPr>
               <w:t>content — genres</w:t>
             </w:r>
           </w:p>
         </w:tc>
         <w:tc>
           <w:tcPr>
-            <w:tcW w:type="dxa" w:w="3312"/>
+            <w:tcW w:type="dxa" w:w="3408"/>
           </w:tcPr>
           <w:p>
             <w:r>
+              <w:rPr>
+                <w:sz w:val="18"/>
+              </w:rPr>
               <w:t>N : M</w:t>
             </w:r>
           </w:p>
         </w:tc>
         <w:tc>
           <w:tcPr>
-            <w:tcW w:type="dxa" w:w="3312"/>
+            <w:tcW w:type="dxa" w:w="3408"/>
           </w:tcPr>
           <w:p>
             <w:r>
+              <w:rPr>
+                <w:sz w:val="18"/>
+              </w:rPr>
               <w:t>content_genres ara tablosu</w:t>
             </w:r>
           </w:p>
@@ -348,30 +412,39 @@
       <w:tr>
         <w:tc>
           <w:tcPr>
-            <w:tcW w:type="dxa" w:w="3312"/>
+            <w:tcW w:type="dxa" w:w="3408"/>
           </w:tcPr>
           <w:p>
             <w:r>
+              <w:rPr>
+                <w:sz w:val="18"/>
+              </w:rPr>
               <w:t>content — people</w:t>
             </w:r>
           </w:p>
         </w:tc>
         <w:tc>
           <w:tcPr>
-            <w:tcW w:type="dxa" w:w="3312"/>
+            <w:tcW w:type="dxa" w:w="3408"/>
           </w:tcPr>
           <w:p>
             <w:r>
+              <w:rPr>
+                <w:sz w:val="18"/>
+              </w:rPr>
               <w:t>N : M</w:t>
             </w:r>
           </w:p>
         </w:tc>
         <w:tc>
           <w:tcPr>
-            <w:tcW w:type="dxa" w:w="3312"/>
+            <w:tcW w:type="dxa" w:w="3408"/>
           </w:tcPr>
           <w:p>
             <w:r>
+              <w:rPr>
+                <w:sz w:val="18"/>
+              </w:rPr>
               <w:t>content_cast ara tablosu (+ rol)</w:t>
             </w:r>
           </w:p>
@@ -380,30 +453,39 @@
       <w:tr>
         <w:tc>
           <w:tcPr>
-            <w:tcW w:type="dxa" w:w="3312"/>
+            <w:tcW w:type="dxa" w:w="3408"/>
           </w:tcPr>
           <w:p>
             <w:r>
+              <w:rPr>
+                <w:sz w:val="18"/>
+              </w:rPr>
               <w:t>profiles — content</w:t>
             </w:r>
           </w:p>
         </w:tc>
         <w:tc>
           <w:tcPr>
-            <w:tcW w:type="dxa" w:w="3312"/>
+            <w:tcW w:type="dxa" w:w="3408"/>
           </w:tcPr>
           <w:p>
             <w:r>
+              <w:rPr>
+                <w:sz w:val="18"/>
+              </w:rPr>
               <w:t>N : M</w:t>
             </w:r>
           </w:p>
         </w:tc>
         <w:tc>
           <w:tcPr>
-            <w:tcW w:type="dxa" w:w="3312"/>
+            <w:tcW w:type="dxa" w:w="3408"/>
           </w:tcPr>
           <w:p>
             <w:r>
+              <w:rPr>
+                <w:sz w:val="18"/>
+              </w:rPr>
               <w:t>watchlist, favorites, reviews ara tabloları</w:t>
             </w:r>
           </w:p>
@@ -411,39 +493,155 @@
       </w:tr>
     </w:tbl>
     <w:p>
-      <w:r/>
+      <w:pPr>
+        <w:pStyle w:val="Heading2"/>
+        <w:spacing w:before="60" w:after="20"/>
+      </w:pPr>
+      <w:r>
+        <w:rPr>
+          <w:color w:val="1F3864"/>
+          <w:sz w:val="21"/>
+        </w:rPr>
+        <w:t>2.1. Normalizasyon Analizi (1NF → 2NF → 3NF)</w:t>
+      </w:r>
     </w:p>
     <w:p>
+      <w:pPr>
+        <w:spacing w:after="40"/>
+      </w:pPr>
+      <w:r>
+        <w:rPr>
+          <w:sz w:val="20"/>
+        </w:rPr>
+        <w:t>Tasarımın veri tekrarından ve anomalilerden arınmış olduğunu göstermek için, naif bir "tek tablo" tasarımının normalize edilmesi aşağıda örneklenmiştir. Örnek evrensel tablo:</w:t>
+      </w:r>
+    </w:p>
+    <w:p>
+      <w:pPr>
+        <w:spacing w:after="40"/>
+      </w:pPr>
+      <w:r>
+        <w:rPr>
+          <w:i/>
+          <w:sz w:val="19"/>
+        </w:rPr>
+        <w:t>İzlemeKaydı(user_email, user_ad, ülke_adı, ülke_kodu, plan_adı, plan_ücret, içerik_adı, içerik_türleri, yönetmen, puan)</w:t>
+      </w:r>
+    </w:p>
+    <w:p>
+      <w:pPr>
+        <w:pStyle w:val="ListBullet"/>
+        <w:spacing w:after="20"/>
+      </w:pPr>
       <w:r>
         <w:rPr>
           <w:b/>
         </w:rPr>
-        <w:t xml:space="preserve">Normalizasyon (3NF): </w:t>
+        <w:t xml:space="preserve">Anomaliler: </w:t>
       </w:r>
       <w:r>
-        <w:t>Tekrar eden ülke / dil / tür / kişi bilgileri ayrı referans tablolarına çıkarılmıştır; hiçbir tabloda kısmi veya geçişli bağımlılık yoktur. Çoka-çok ilişkiler bileşik birincil anahtarlı ara tablolarla çözülmüştür.</w:t>
+        <w:t>Ekleme — henüz aboneliği olmayan bir planı veya hiç izlenmemiş bir içeriği ekleyememe; Güncelleme — bir planın ücreti değişince o plandaki tüm satırları tek tek güncelleme zorunluluğu; Silme — bir içeriğin son izleme kaydı silininde içerik bilgisinin de kaybolması.</w:t>
+      </w:r>
+    </w:p>
+    <w:p>
+      <w:pPr>
+        <w:pStyle w:val="ListBullet"/>
+        <w:spacing w:after="20"/>
+      </w:pPr>
+      <w:r>
+        <w:rPr>
+          <w:b/>
+        </w:rPr>
+        <w:t xml:space="preserve">Fonksiyonel bağımlılıklar (FD): </w:t>
+      </w:r>
+      <w:r>
+        <w:t>user_email → user_ad, ülke_adı ; ülke_adı → ülke_kodu ; plan_adı → plan_ücret ; içerik_id → içerik_adı, yönetmen. Birincil anahtarın yalnız bir kısmına ya da geçişli bağımlılıklar vardır.</w:t>
+      </w:r>
+    </w:p>
+    <w:p>
+      <w:pPr>
+        <w:pStyle w:val="ListBullet"/>
+        <w:spacing w:after="20"/>
+      </w:pPr>
+      <w:r>
+        <w:rPr>
+          <w:b/>
+        </w:rPr>
+        <w:t xml:space="preserve">1NF (atomiklik): </w:t>
+      </w:r>
+      <w:r>
+        <w:t>içerik_türleri çok-değerli (bir içeriğin birden çok türü) → ayrı satırlara/tabloya taşındı: content_genres(content_id, genre_id).</w:t>
+      </w:r>
+    </w:p>
+    <w:p>
+      <w:pPr>
+        <w:pStyle w:val="ListBullet"/>
+        <w:spacing w:after="20"/>
+      </w:pPr>
+      <w:r>
+        <w:rPr>
+          <w:b/>
+        </w:rPr>
+        <w:t xml:space="preserve">2NF (tam bağımlılık): </w:t>
+      </w:r>
+      <w:r>
+        <w:t>Birincil anahtarın bir kısmına bağlı (kısmi bağımlılık) öznitelikler ayrıldı: users, subscription_plans ve content kendi tablolarına bölündü; ara tablolarda yalnız ilişkiye ait alanlar kaldı.</w:t>
+      </w:r>
+    </w:p>
+    <w:p>
+      <w:pPr>
+        <w:pStyle w:val="ListBullet"/>
+        <w:spacing w:after="20"/>
+      </w:pPr>
+      <w:r>
+        <w:rPr>
+          <w:b/>
+        </w:rPr>
+        <w:t xml:space="preserve">3NF (geçişli bağımlılık yok): </w:t>
+      </w:r>
+      <w:r>
+        <w:t>Anahtar olmayan öznitelik üzerinden dolaylı bağımlılıklar giderildi: user_email → ülke_adı → ülke_kodu zinciri countries tablosuna; plan_adı → plan_ücret bağımlılığı subscription_plans tablosuna; yönetmen bilgisi people + content_cast tablolarına ayrıldı.</w:t>
+      </w:r>
+    </w:p>
+    <w:p>
+      <w:pPr>
+        <w:spacing w:after="40"/>
+      </w:pPr>
+      <w:r>
+        <w:rPr>
+          <w:sz w:val="19"/>
+        </w:rPr>
+        <w:t>Sonuç: Elde edilen 22 tablonun tamamı 3NF'dedir — her tabloda anahtar olmayan tüm öznitelikler birincil anahtara tam ve geçişsiz bağlıdır. Tabloların büyük kısmı, her belirleyicinin aday anahtar olması nedeniyle BCNF koşulunu da sağlar. Ayrışım kayıpsız (lossless) ve bağımlılık koruyucudur.</w:t>
       </w:r>
     </w:p>
     <w:p>
       <w:pPr>
         <w:pStyle w:val="Heading1"/>
+        <w:spacing w:before="80" w:after="40"/>
       </w:pPr>
       <w:r>
         <w:rPr>
           <w:color w:val="1F3864"/>
-          <w:sz w:val="26"/>
+          <w:sz w:val="25"/>
         </w:rPr>
         <w:t>3. Fiziksel Tasarım</w:t>
       </w:r>
     </w:p>
     <w:p>
+      <w:pPr>
+        <w:spacing w:after="40"/>
+      </w:pPr>
       <w:r>
-        <w:t>01_create_tables.sql dosyası tüm tabloları MySQL 8.0 üzerinde oluşturur. Uygulanan bütünlük kısıtları:</w:t>
+        <w:rPr>
+          <w:sz w:val="20"/>
+        </w:rPr>
+        <w:t>01_create_tables.sql tüm tabloları MySQL 8.0 üzerinde oluşturur. Uygulanan bütünlük kısıtları:</w:t>
       </w:r>
     </w:p>
     <w:p>
       <w:pPr>
         <w:pStyle w:val="ListBullet"/>
+        <w:spacing w:after="20"/>
       </w:pPr>
       <w:r>
         <w:rPr>
@@ -458,6 +656,7 @@
     <w:p>
       <w:pPr>
         <w:pStyle w:val="ListBullet"/>
+        <w:spacing w:after="20"/>
       </w:pPr>
       <w:r>
         <w:rPr>
@@ -472,6 +671,7 @@
     <w:p>
       <w:pPr>
         <w:pStyle w:val="ListBullet"/>
+        <w:spacing w:after="20"/>
       </w:pPr>
       <w:r>
         <w:rPr>
@@ -486,32 +686,22 @@
     <w:p>
       <w:pPr>
         <w:pStyle w:val="ListBullet"/>
+        <w:spacing w:after="20"/>
       </w:pPr>
       <w:r>
         <w:rPr>
           <w:b/>
         </w:rPr>
-        <w:t xml:space="preserve">NOT NULL: </w:t>
-      </w:r>
-      <w:r>
-        <w:t>Zorunlu alanlarda (e-posta, başlık, tarih vb.).</w:t>
-      </w:r>
-    </w:p>
-    <w:p>
-      <w:pPr>
-        <w:pStyle w:val="ListBullet"/>
-      </w:pPr>
-      <w:r>
-        <w:rPr>
-          <w:b/>
-        </w:rPr>
-        <w:t xml:space="preserve">CHECK: </w:t>
+        <w:t xml:space="preserve">NOT NULL / CHECK: </w:t>
       </w:r>
       <w:r>
         <w:t>rating BETWEEN 1 AND 10, progress_percent BETWEEN 0 AND 100, content_type IN ('Movie','Series'), payment_status IN ('Success','Failed','Refunded') vb.</w:t>
       </w:r>
     </w:p>
     <w:p>
+      <w:pPr>
+        <w:spacing w:after="40"/>
+      </w:pPr>
       <w:r>
         <w:rPr>
           <w:b/>
@@ -525,23 +715,31 @@
     <w:p>
       <w:pPr>
         <w:pStyle w:val="Heading1"/>
+        <w:spacing w:before="80" w:after="40"/>
       </w:pPr>
       <w:r>
         <w:rPr>
           <w:color w:val="1F3864"/>
-          <w:sz w:val="26"/>
+          <w:sz w:val="25"/>
         </w:rPr>
         <w:t>4. SQL Uygulaması</w:t>
       </w:r>
     </w:p>
     <w:p>
+      <w:pPr>
+        <w:spacing w:after="40"/>
+      </w:pPr>
       <w:r>
+        <w:rPr>
+          <w:sz w:val="20"/>
+        </w:rPr>
         <w:t>Her ifade öncesinde anlamlı bir iş sorusu (business question) belirtilmiştir.</w:t>
       </w:r>
     </w:p>
     <w:p>
       <w:pPr>
         <w:pStyle w:val="ListBullet"/>
+        <w:spacing w:after="20"/>
       </w:pPr>
       <w:r>
         <w:rPr>
@@ -550,12 +748,13 @@
         <w:t xml:space="preserve">03_dml_operations.sql — </w:t>
       </w:r>
       <w:r>
-        <w:t>14 DML işlemi: 5 INSERT (yeni kayıt, abonelik, profil, izleme listesi, yorum), 5 UPDATE (plan değişikliği, abonelik süresi dolması, dizi durumu, izleme tamamlama, hesap aktifleştirme), 4 DELETE (listeden çıkarma, başarısız ödeme temizliği, hesap silme/cascade).</w:t>
+        <w:t>14 DML işlemi: 5 INSERT, 5 UPDATE, 4 DELETE (yeni kayıt/abonelik/profil, plan değişikliği, abonelik süresi dolması, hesap silme/cascade vb.).</w:t>
       </w:r>
     </w:p>
     <w:p>
       <w:pPr>
         <w:pStyle w:val="ListBullet"/>
+        <w:spacing w:after="20"/>
       </w:pPr>
       <w:r>
         <w:rPr>
@@ -564,7 +763,7 @@
         <w:t xml:space="preserve">04_queries.sql — </w:t>
       </w:r>
       <w:r>
-        <w:t>5 basit sorgu (filtreleme/sıralama) ve 7 karmaşık sorgu (JOIN, GROUP BY/HAVING, alt sorgu, NOT EXISTS): içerik başına ortalama puan, en kalabalık türler, kullanıcı başına toplam ödeme, ortalamanın üstündeki içerikler, hiç izlenmemiş içerikler, en çok favorilenen 5 içerik, belirli yönetmenin içerikleri.</w:t>
+        <w:t>5 basit sorgu (filtreleme/sıralama) ve 7 karmaşık sorgu (JOIN, GROUP BY/HAVING, alt sorgu, NOT EXISTS): içerik başına ortalama puan, en kalabalık türler, kullanıcı başına toplam ödeme, ortalamanın üstündeki içerikler, hiç izlenmemiş içerikler, en çok favorilenen 5 içerik vb.</w:t>
       </w:r>
     </w:p>
     <w:p>
@@ -572,15 +771,15 @@
         <w:rPr>
           <w:b/>
         </w:rPr>
-        <w:t xml:space="preserve">Doğrulama: </w:t>
+        <w:t xml:space="preserve">Doğrulama &amp; Canlı Demo: </w:t>
       </w:r>
       <w:r>
-        <w:t>Tüm dosyalar (CREATE + veri + DML + 12 sorgu) referans bütünlüğü kontrolü açıkken hatasız çalıştırılarak test edilmiştir. Canlı demo MySQL üzerinde dosyalar 01→02→03→04 sırasıyla çalıştırılarak; E-R diyagramı dbdiagram.io üzerinde schema.dbml ile gösterilir.</w:t>
+        <w:t>Tüm dosyalar (CREATE + veri + DML + 12 sorgu) gerçek bir MySQL 8.4 sunucusunda hatasız çalıştırılarak test edilmiştir. Canlı demo MySQL Workbench üzerinde dosyalar 01→02→03→04 sırasıyla; E-R diyagramı dbdiagram.io üzerinde schema.dbml ile gösterilir.</w:t>
       </w:r>
     </w:p>
     <w:sectPr>
       <w:pgSz w:w="12240" w:h="15840"/>
-      <w:pgMar w:top="1152" w:right="1152" w:bottom="1152" w:left="1152" w:header="720" w:footer="720" w:gutter="0"/>
+      <w:pgMar w:top="1008" w:right="1008" w:bottom="1008" w:left="1008" w:header="720" w:footer="720" w:gutter="0"/>
       <w:cols w:space="720"/>
       <w:docGrid w:linePitch="360"/>
     </w:sectPr>
@@ -953,7 +1152,7 @@
     <w:rsid w:val="00FC693F"/>
     <w:rPr>
       <w:rFonts w:ascii="Calibri" w:hAnsi="Calibri"/>
-      <w:sz w:val="21"/>
+      <w:sz w:val="20"/>
     </w:rPr>
   </w:style>
   <w:style w:type="paragraph" w:styleId="Header">

</xml_diff>

<commit_message>
Translate everything to English (comments, data text, report, guides)
</commit_message>
<xml_diff>
--- a/report.docx
+++ b/report.docx
@@ -12,7 +12,7 @@
           <w:color w:val="1F3864"/>
           <w:sz w:val="30"/>
         </w:rPr>
-        <w:t>STREAMFLIX — Dizi &amp; Film İzleme Platformu Veritabanı Sistemi</w:t>
+        <w:t>STREAMFLIX - Movie &amp; Series Streaming Platform Database</w:t>
       </w:r>
     </w:p>
     <w:p>
@@ -24,7 +24,7 @@
           <w:i/>
           <w:sz w:val="21"/>
         </w:rPr>
-        <w:t>Veritabanı Sistemleri (COMP2004) Dönem Projesi</w:t>
+        <w:t>Database Management Systems (COMP2004) - Term Project</w:t>
       </w:r>
     </w:p>
     <w:p>
@@ -35,7 +35,7 @@
         <w:rPr>
           <w:sz w:val="19"/>
         </w:rPr>
-        <w:t>Grup Üyeleri: Göktuğ Karaca, Defne Kaya   ·   Tarih: 29.05.2026</w:t>
+        <w:t>Team: Goktug Karaca, Defne Kaya    Date: 29 May 2026</w:t>
       </w:r>
     </w:p>
     <w:p>
@@ -48,7 +48,7 @@
           <w:color w:val="1F3864"/>
           <w:sz w:val="25"/>
         </w:rPr>
-        <w:t>1. Sistem Tanımı ve Fonksiyonel Gereksinimler</w:t>
+        <w:t>1. System and Requirements</w:t>
       </w:r>
     </w:p>
     <w:p>
@@ -59,7 +59,7 @@
         <w:rPr>
           <w:sz w:val="20"/>
         </w:rPr>
-        <w:t>STREAMFLIX, kullanıcıların film ve dizi izleyebildiği, kişisel hesaplarıyla giriş yaparak içerikleri izleme listesine ekleyebildiği, favorileyebildiği, puanlayıp yorum yapabildiği bir dijital içerik yayın (streaming) platformudur. Netflix benzeri bir sistemin veri katmanını modeller; web/mobil arayüz kapsam dışıdır, odak ilişkisel veritabanı tasarımıdır. Başlıca fonksiyonel gereksinimler:</w:t>
+        <w:t>STREAMFLIX is the database for a movie and series streaming service like Netflix. Users sign up with their own details, log in, and watch films and series. They can add titles to a watchlist, mark favorites, keep a watch history, and rate or review what they watch. We only built the database layer; there is no web or mobile app. The main requirements are:</w:t>
       </w:r>
     </w:p>
     <w:p>
@@ -68,7 +68,7 @@
         <w:spacing w:after="20"/>
       </w:pPr>
       <w:r>
-        <w:t>Kullanıcılar kişisel bilgileriyle (e-posta, ad, ülke, doğum tarihi) kayıt olur ve giriş yapar.</w:t>
+        <w:t>Users register with personal info (email, name, country, birth date) and log in.</w:t>
       </w:r>
     </w:p>
     <w:p>
@@ -77,7 +77,7 @@
         <w:spacing w:after="20"/>
       </w:pPr>
       <w:r>
-        <w:t>Bir hesap altında birden fazla profil (yetişkin / çocuk) bulunabilir.</w:t>
+        <w:t>An account can hold several profiles, including a kids profile.</w:t>
       </w:r>
     </w:p>
     <w:p>
@@ -86,7 +86,7 @@
         <w:spacing w:after="20"/>
       </w:pPr>
       <w:r>
-        <w:t>Kullanıcılar üç abonelik planından (Basic/Standard/Premium) birine abone olur ve aylık ödeme yapar.</w:t>
+        <w:t>Users pick one of three plans (Basic, Standard, Premium) and pay monthly.</w:t>
       </w:r>
     </w:p>
     <w:p>
@@ -95,7 +95,7 @@
         <w:spacing w:after="20"/>
       </w:pPr>
       <w:r>
-        <w:t>İçerikler film veya dizi olabilir; diziler sezon ve bölümlere ayrılır.</w:t>
+        <w:t>Content is either a movie or a series; series have seasons and episodes.</w:t>
       </w:r>
     </w:p>
     <w:p>
@@ -104,7 +104,7 @@
         <w:spacing w:after="20"/>
       </w:pPr>
       <w:r>
-        <w:t>Her içeriğin birden çok türü ve oyuncu/yönetmen kadrosu vardır.</w:t>
+        <w:t>Each title has one or more genres and a cast of actors and directors.</w:t>
       </w:r>
     </w:p>
     <w:p>
@@ -113,7 +113,7 @@
         <w:spacing w:after="20"/>
       </w:pPr>
       <w:r>
-        <w:t>Profiller içeriği izleme listesine/favorilere ekler; izleme geçmişi tutulur; puan ve yorum yazılır.</w:t>
+        <w:t>Profiles keep a watchlist, favorites, watch history, and reviews with a rating.</w:t>
       </w:r>
     </w:p>
     <w:p>
@@ -122,7 +122,7 @@
         <w:spacing w:after="20"/>
       </w:pPr>
       <w:r>
-        <w:t>İçeriklerin altyazı dilleri ve kullanıcıların cihazları kaydedilir.</w:t>
+        <w:t>We also store subtitle languages per title and the devices each user signs in from.</w:t>
       </w:r>
     </w:p>
     <w:p>
@@ -135,7 +135,7 @@
           <w:color w:val="1F3864"/>
           <w:sz w:val="25"/>
         </w:rPr>
-        <w:t>2. Mantıksal Tasarım (E-R Modeli)</w:t>
+        <w:t>2. Logical Design (E-R Model)</w:t>
       </w:r>
     </w:p>
     <w:p>
@@ -146,7 +146,7 @@
         <w:rPr>
           <w:sz w:val="20"/>
         </w:rPr>
-        <w:t>Sistem 22 normalize tablo içerir. Tüm tablo, anahtar, kardinalite ve ilişkiler schema.dbml dosyasında tanımlıdır ve dbdiagram.io üzerinde görsel E-R diyagramı olarak üretilir. Başlıca ilişkiler:</w:t>
+        <w:t>The system has 22 tables. All tables, keys, and relationships are defined in schema.dbml and drawn as an E-R diagram on dbdiagram.io. The main relationships are:</w:t>
       </w:r>
     </w:p>
     <w:tbl>
@@ -171,7 +171,7 @@
                 <w:b/>
                 <w:sz w:val="18"/>
               </w:rPr>
-              <w:t>İlişki</w:t>
+              <w:t>Relationship</w:t>
             </w:r>
           </w:p>
         </w:tc>
@@ -185,7 +185,7 @@
                 <w:b/>
                 <w:sz w:val="18"/>
               </w:rPr>
-              <w:t>Kardinalite</w:t>
+              <w:t>Cardinality</w:t>
             </w:r>
           </w:p>
         </w:tc>
@@ -199,7 +199,7 @@
                 <w:b/>
                 <w:sz w:val="18"/>
               </w:rPr>
-              <w:t>Açıklama</w:t>
+              <w:t>Note</w:t>
             </w:r>
           </w:p>
         </w:tc>
@@ -214,7 +214,7 @@
               <w:rPr>
                 <w:sz w:val="18"/>
               </w:rPr>
-              <w:t>users — profiles</w:t>
+              <w:t>users - profiles</w:t>
             </w:r>
           </w:p>
         </w:tc>
@@ -240,7 +240,7 @@
               <w:rPr>
                 <w:sz w:val="18"/>
               </w:rPr>
-              <w:t>Bir hesap birçok profile sahip</w:t>
+              <w:t>One account, many profiles</w:t>
             </w:r>
           </w:p>
         </w:tc>
@@ -255,7 +255,7 @@
               <w:rPr>
                 <w:sz w:val="18"/>
               </w:rPr>
-              <w:t>users — subscriptions — payments</w:t>
+              <w:t>users - subscriptions - payments</w:t>
             </w:r>
           </w:p>
         </w:tc>
@@ -281,7 +281,7 @@
               <w:rPr>
                 <w:sz w:val="18"/>
               </w:rPr>
-              <w:t>Abonelik ve ödeme zinciri</w:t>
+              <w:t>Subscription and payment chain</w:t>
             </w:r>
           </w:p>
         </w:tc>
@@ -296,7 +296,7 @@
               <w:rPr>
                 <w:sz w:val="18"/>
               </w:rPr>
-              <w:t>content — movies / series</w:t>
+              <w:t>content - movies / series</w:t>
             </w:r>
           </w:p>
         </w:tc>
@@ -322,7 +322,7 @@
               <w:rPr>
                 <w:sz w:val="18"/>
               </w:rPr>
-              <w:t>Üst tip / alt tip (ISA) ayrımı</w:t>
+              <w:t>Supertype / subtype split</w:t>
             </w:r>
           </w:p>
         </w:tc>
@@ -337,7 +337,7 @@
               <w:rPr>
                 <w:sz w:val="18"/>
               </w:rPr>
-              <w:t>series — seasons — episodes</w:t>
+              <w:t>series - seasons - episodes</w:t>
             </w:r>
           </w:p>
         </w:tc>
@@ -363,7 +363,7 @@
               <w:rPr>
                 <w:sz w:val="18"/>
               </w:rPr>
-              <w:t>Dizi hiyerarşisi</w:t>
+              <w:t>Series hierarchy</w:t>
             </w:r>
           </w:p>
         </w:tc>
@@ -378,7 +378,7 @@
               <w:rPr>
                 <w:sz w:val="18"/>
               </w:rPr>
-              <w:t>content — genres</w:t>
+              <w:t>content - genres</w:t>
             </w:r>
           </w:p>
         </w:tc>
@@ -404,7 +404,7 @@
               <w:rPr>
                 <w:sz w:val="18"/>
               </w:rPr>
-              <w:t>content_genres ara tablosu</w:t>
+              <w:t>via content_genres</w:t>
             </w:r>
           </w:p>
         </w:tc>
@@ -419,7 +419,7 @@
               <w:rPr>
                 <w:sz w:val="18"/>
               </w:rPr>
-              <w:t>content — people</w:t>
+              <w:t>content - people</w:t>
             </w:r>
           </w:p>
         </w:tc>
@@ -445,7 +445,7 @@
               <w:rPr>
                 <w:sz w:val="18"/>
               </w:rPr>
-              <w:t>content_cast ara tablosu (+ rol)</w:t>
+              <w:t>via content_cast (with role)</w:t>
             </w:r>
           </w:p>
         </w:tc>
@@ -460,7 +460,7 @@
               <w:rPr>
                 <w:sz w:val="18"/>
               </w:rPr>
-              <w:t>profiles — content</w:t>
+              <w:t>profiles - content</w:t>
             </w:r>
           </w:p>
         </w:tc>
@@ -486,7 +486,7 @@
               <w:rPr>
                 <w:sz w:val="18"/>
               </w:rPr>
-              <w:t>watchlist, favorites, reviews ara tabloları</w:t>
+              <w:t>via watchlist, favorites, reviews</w:t>
             </w:r>
           </w:p>
         </w:tc>
@@ -502,7 +502,7 @@
           <w:color w:val="1F3864"/>
           <w:sz w:val="21"/>
         </w:rPr>
-        <w:t>2.1. Normalizasyon Analizi (1NF → 2NF → 3NF)</w:t>
+        <w:t>2.1. Normalization (1NF to 3NF)</w:t>
       </w:r>
     </w:p>
     <w:p>
@@ -513,7 +513,7 @@
         <w:rPr>
           <w:sz w:val="20"/>
         </w:rPr>
-        <w:t>Tasarımın veri tekrarından ve anomalilerden arınmış olduğunu göstermek için, naif bir "tek tablo" tasarımının normalize edilmesi aşağıda örneklenmiştir. Örnek evrensel tablo:</w:t>
+        <w:t>To show the design avoids redundancy, here is how a single flat table would be broken down. Start with one wide table:</w:t>
       </w:r>
     </w:p>
     <w:p>
@@ -525,7 +525,7 @@
           <w:i/>
           <w:sz w:val="19"/>
         </w:rPr>
-        <w:t>İzlemeKaydı(user_email, user_ad, ülke_adı, ülke_kodu, plan_adı, plan_ücret, içerik_adı, içerik_türleri, yönetmen, puan)</w:t>
+        <w:t>Watch(user_email, user_name, country_name, country_code, plan_name, plan_price, title, genres, director, rating)</w:t>
       </w:r>
     </w:p>
     <w:p>
@@ -537,10 +537,10 @@
         <w:rPr>
           <w:b/>
         </w:rPr>
-        <w:t xml:space="preserve">Anomaliler: </w:t>
+        <w:t xml:space="preserve">Anomalies: </w:t>
       </w:r>
       <w:r>
-        <w:t>Ekleme — henüz aboneliği olmayan bir planı veya hiç izlenmemiş bir içeriği ekleyememe; Güncelleme — bir planın ücreti değişince o plandaki tüm satırları tek tek güncelleme zorunluluğu; Silme — bir içeriğin son izleme kaydı silininde içerik bilgisinin de kaybolması.</w:t>
+        <w:t>Insertion - cannot add a plan or a title until someone uses it. Update - changing a plan price means editing every matching row. Deletion - removing the last view of a title loses the title itself.</w:t>
       </w:r>
     </w:p>
     <w:p>
@@ -552,10 +552,10 @@
         <w:rPr>
           <w:b/>
         </w:rPr>
-        <w:t xml:space="preserve">Fonksiyonel bağımlılıklar (FD): </w:t>
+        <w:t xml:space="preserve">Functional dependencies: </w:t>
       </w:r>
       <w:r>
-        <w:t>user_email → user_ad, ülke_adı ; ülke_adı → ülke_kodu ; plan_adı → plan_ücret ; içerik_id → içerik_adı, yönetmen. Birincil anahtarın yalnız bir kısmına ya da geçişli bağımlılıklar vardır.</w:t>
+        <w:t>user_email -&gt; user_name, country_name; country_name -&gt; country_code; plan_name -&gt; plan_price; content_id -&gt; title, director.</w:t>
       </w:r>
     </w:p>
     <w:p>
@@ -567,10 +567,10 @@
         <w:rPr>
           <w:b/>
         </w:rPr>
-        <w:t xml:space="preserve">1NF (atomiklik): </w:t>
+        <w:t xml:space="preserve">1NF: </w:t>
       </w:r>
       <w:r>
-        <w:t>içerik_türleri çok-değerli (bir içeriğin birden çok türü) → ayrı satırlara/tabloya taşındı: content_genres(content_id, genre_id).</w:t>
+        <w:t>genres is multi-valued, so it moves to its own rows: content_genres(content_id, genre_id).</w:t>
       </w:r>
     </w:p>
     <w:p>
@@ -582,10 +582,10 @@
         <w:rPr>
           <w:b/>
         </w:rPr>
-        <w:t xml:space="preserve">2NF (tam bağımlılık): </w:t>
+        <w:t xml:space="preserve">2NF: </w:t>
       </w:r>
       <w:r>
-        <w:t>Birincil anahtarın bir kısmına bağlı (kısmi bağımlılık) öznitelikler ayrıldı: users, subscription_plans ve content kendi tablolarına bölündü; ara tablolarda yalnız ilişkiye ait alanlar kaldı.</w:t>
+        <w:t>Partial dependencies are removed by splitting out users, subscription_plans and content.</w:t>
       </w:r>
     </w:p>
     <w:p>
@@ -597,10 +597,10 @@
         <w:rPr>
           <w:b/>
         </w:rPr>
-        <w:t xml:space="preserve">3NF (geçişli bağımlılık yok): </w:t>
+        <w:t xml:space="preserve">3NF: </w:t>
       </w:r>
       <w:r>
-        <w:t>Anahtar olmayan öznitelik üzerinden dolaylı bağımlılıklar giderildi: user_email → ülke_adı → ülke_kodu zinciri countries tablosuna; plan_adı → plan_ücret bağımlılığı subscription_plans tablosuna; yönetmen bilgisi people + content_cast tablolarına ayrıldı.</w:t>
+        <w:t>Transitive dependencies are removed: country_name -&gt; country_code goes to countries; plan_price goes to subscription_plans; director goes to people + content_cast.</w:t>
       </w:r>
     </w:p>
     <w:p>
@@ -611,7 +611,7 @@
         <w:rPr>
           <w:sz w:val="19"/>
         </w:rPr>
-        <w:t>Sonuç: Elde edilen 22 tablonun tamamı 3NF'dedir — her tabloda anahtar olmayan tüm öznitelikler birincil anahtara tam ve geçişsiz bağlıdır. Tabloların büyük kısmı, her belirleyicinin aday anahtar olması nedeniyle BCNF koşulunu da sağlar. Ayrışım kayıpsız (lossless) ve bağımlılık koruyucudur.</w:t>
+        <w:t>After this, all 22 tables are in 3NF: every non-key column depends fully and directly on its primary key. Most tables are also in BCNF. The decomposition is lossless and dependency preserving.</w:t>
       </w:r>
     </w:p>
     <w:p>
@@ -624,7 +624,7 @@
           <w:color w:val="1F3864"/>
           <w:sz w:val="25"/>
         </w:rPr>
-        <w:t>3. Fiziksel Tasarım</w:t>
+        <w:t>3. Physical Design</w:t>
       </w:r>
     </w:p>
     <w:p>
@@ -635,7 +635,7 @@
         <w:rPr>
           <w:sz w:val="20"/>
         </w:rPr>
-        <w:t>01_create_tables.sql tüm tabloları MySQL 8.0 üzerinde oluşturur. Uygulanan bütünlük kısıtları:</w:t>
+        <w:t>01_create_tables.sql builds every table on MySQL 8.0. Constraints used:</w:t>
       </w:r>
     </w:p>
     <w:p>
@@ -647,10 +647,10 @@
         <w:rPr>
           <w:b/>
         </w:rPr>
-        <w:t xml:space="preserve">Primary Key: </w:t>
+        <w:t xml:space="preserve">Primary keys: </w:t>
       </w:r>
       <w:r>
-        <w:t>Her tabloda; ara tablolarda bileşik PK (ör. content_genres(content_id, genre_id)).</w:t>
+        <w:t>on every table; composite keys on link tables (e.g. content_genres).</w:t>
       </w:r>
     </w:p>
     <w:p>
@@ -662,10 +662,10 @@
         <w:rPr>
           <w:b/>
         </w:rPr>
-        <w:t xml:space="preserve">Foreign Key: </w:t>
+        <w:t xml:space="preserve">Foreign keys: </w:t>
       </w:r>
       <w:r>
-        <w:t>Tüm ilişkilerde; uygun yerlerde ON DELETE CASCADE (kullanıcı silinince profilleri, abonelikleri, cihazları da silinir).</w:t>
+        <w:t>on all relationships, with ON DELETE CASCADE where it makes sense (deleting a user also removes their profiles, subscriptions and devices).</w:t>
       </w:r>
     </w:p>
     <w:p>
@@ -680,7 +680,7 @@
         <w:t xml:space="preserve">UNIQUE: </w:t>
       </w:r>
       <w:r>
-        <w:t>users.email, genres.genre_name, reviews(profile_id, content_id) — profil başına içerik başına tek yorum.</w:t>
+        <w:t>users.email, genres.genre_name, and reviews(profile_id, content_id) so a profile reviews a title once.</w:t>
       </w:r>
     </w:p>
     <w:p>
@@ -695,7 +695,7 @@
         <w:t xml:space="preserve">NOT NULL / CHECK: </w:t>
       </w:r>
       <w:r>
-        <w:t>rating BETWEEN 1 AND 10, progress_percent BETWEEN 0 AND 100, content_type IN ('Movie','Series'), payment_status IN ('Success','Failed','Refunded') vb.</w:t>
+        <w:t>rating BETWEEN 1 AND 10, progress_percent BETWEEN 0 AND 100, content_type IN ('Movie','Series'), payment_status IN ('Success','Failed','Refunded'), and similar.</w:t>
       </w:r>
     </w:p>
     <w:p>
@@ -706,10 +706,10 @@
         <w:rPr>
           <w:b/>
         </w:rPr>
-        <w:t xml:space="preserve">Örnek veri: </w:t>
+        <w:t xml:space="preserve">Sample data: </w:t>
       </w:r>
       <w:r>
-        <w:t>02_sample_data.sql ile 426 kayıt 22 tabloya dağıtılmıştır (15 kullanıcı, 26 profil, 20 içerik, 32 bölüm, 28 izleme geçmişi, 20 yorum…). Tüm veriler FK kontrolü açıkken hatasız yüklenmektedir.</w:t>
+        <w:t>02_sample_data.sql loads 426 rows across the 22 tables (15 users, 26 profiles, 20 titles, 32 episodes, 28 history rows, 20 reviews, and so on). All rows load cleanly with foreign key checks on.</w:t>
       </w:r>
     </w:p>
     <w:p>
@@ -722,7 +722,7 @@
           <w:color w:val="1F3864"/>
           <w:sz w:val="25"/>
         </w:rPr>
-        <w:t>4. SQL Uygulaması</w:t>
+        <w:t>4. SQL Implementation</w:t>
       </w:r>
     </w:p>
     <w:p>
@@ -733,7 +733,7 @@
         <w:rPr>
           <w:sz w:val="20"/>
         </w:rPr>
-        <w:t>Her ifade öncesinde anlamlı bir iş sorusu (business question) belirtilmiştir.</w:t>
+        <w:t>Every statement has a short business question above it.</w:t>
       </w:r>
     </w:p>
     <w:p>
@@ -745,10 +745,10 @@
         <w:rPr>
           <w:b/>
         </w:rPr>
-        <w:t xml:space="preserve">03_dml_operations.sql — </w:t>
+        <w:t xml:space="preserve">03_dml_operations.sql: </w:t>
       </w:r>
       <w:r>
-        <w:t>14 DML işlemi: 5 INSERT, 5 UPDATE, 4 DELETE (yeni kayıt/abonelik/profil, plan değişikliği, abonelik süresi dolması, hesap silme/cascade vb.).</w:t>
+        <w:t>14 statements - 5 INSERT, 5 UPDATE, 4 DELETE (new signup, subscription, profile, plan downgrade, expiring subscriptions, account deletion with cascade, and more).</w:t>
       </w:r>
     </w:p>
     <w:p>
@@ -760,10 +760,10 @@
         <w:rPr>
           <w:b/>
         </w:rPr>
-        <w:t xml:space="preserve">04_queries.sql — </w:t>
+        <w:t xml:space="preserve">04_queries.sql: </w:t>
       </w:r>
       <w:r>
-        <w:t>5 basit sorgu (filtreleme/sıralama) ve 7 karmaşık sorgu (JOIN, GROUP BY/HAVING, alt sorgu, NOT EXISTS): içerik başına ortalama puan, en kalabalık türler, kullanıcı başına toplam ödeme, ortalamanın üstündeki içerikler, hiç izlenmemiş içerikler, en çok favorilenen 5 içerik vb.</w:t>
+        <w:t>5 simple queries (filtering and sorting) and 7 complex ones using JOIN, GROUP BY / HAVING, and subqueries: average rating per title, busiest genres, total paid per user, titles above the average rating, titles never watched, top 5 favorites, and titles by a given director.</w:t>
       </w:r>
     </w:p>
     <w:p>
@@ -771,10 +771,10 @@
         <w:rPr>
           <w:b/>
         </w:rPr>
-        <w:t xml:space="preserve">Doğrulama &amp; Canlı Demo: </w:t>
+        <w:t xml:space="preserve">Testing and demo: </w:t>
       </w:r>
       <w:r>
-        <w:t>Tüm dosyalar (CREATE + veri + DML + 12 sorgu) gerçek bir MySQL 8.4 sunucusunda hatasız çalıştırılarak test edilmiştir. Canlı demo MySQL Workbench üzerinde dosyalar 01→02→03→04 sırasıyla; E-R diyagramı dbdiagram.io üzerinde schema.dbml ile gösterilir.</w:t>
+        <w:t>All files (schema, data, DML and the 12 queries) were run on a real MySQL 8.4 server with no errors. The live demo runs in MySQL Workbench in order 01 to 04; the E-R diagram is shown on dbdiagram.io from schema.dbml.</w:t>
       </w:r>
     </w:p>
     <w:sectPr>

</xml_diff>

<commit_message>
Simplify schema to 11 tables per team request (drop countries, languages, subtitles, payments, devices, watchlist, profiles, movies/series/seasons/episodes)
</commit_message>
<xml_diff>
--- a/report.docx
+++ b/report.docx
@@ -59,7 +59,7 @@
         <w:rPr>
           <w:sz w:val="20"/>
         </w:rPr>
-        <w:t>STREAMFLIX is the database for a movie and series streaming service like Netflix. Users sign up with their own details, log in, and watch films and series. They can add titles to a watchlist, mark favorites, keep a watch history, and rate or review what they watch. We only built the database layer; there is no web or mobile app. The main requirements are:</w:t>
+        <w:t>STREAMFLIX is the database for a movie and series streaming service like Netflix. Users sign up with their own details, log in, and watch films and series. They can mark favorites, keep a watch history, and rate or review titles. We only built the database layer; there is no web or mobile app. Main requirements:</w:t>
       </w:r>
     </w:p>
     <w:p>
@@ -77,7 +77,7 @@
         <w:spacing w:after="20"/>
       </w:pPr>
       <w:r>
-        <w:t>An account can hold several profiles, including a kids profile.</w:t>
+        <w:t>Users pick one of three plans (Basic, Standard, Premium) and the payment status is tracked.</w:t>
       </w:r>
     </w:p>
     <w:p>
@@ -86,16 +86,7 @@
         <w:spacing w:after="20"/>
       </w:pPr>
       <w:r>
-        <w:t>Users pick one of three plans (Basic, Standard, Premium) and pay monthly.</w:t>
-      </w:r>
-    </w:p>
-    <w:p>
-      <w:pPr>
-        <w:pStyle w:val="ListBullet"/>
-        <w:spacing w:after="20"/>
-      </w:pPr>
-      <w:r>
-        <w:t>Content is either a movie or a series; series have seasons and episodes.</w:t>
+        <w:t>Content is either a movie or a series.</w:t>
       </w:r>
     </w:p>
     <w:p>
@@ -113,16 +104,7 @@
         <w:spacing w:after="20"/>
       </w:pPr>
       <w:r>
-        <w:t>Profiles keep a watchlist, favorites, watch history, and reviews with a rating.</w:t>
-      </w:r>
-    </w:p>
-    <w:p>
-      <w:pPr>
-        <w:pStyle w:val="ListBullet"/>
-        <w:spacing w:after="20"/>
-      </w:pPr>
-      <w:r>
-        <w:t>We also store subtitle languages per title and the devices each user signs in from.</w:t>
+        <w:t>Users keep favorites, a watch history, and reviews with a rating.</w:t>
       </w:r>
     </w:p>
     <w:p>
@@ -146,7 +128,7 @@
         <w:rPr>
           <w:sz w:val="20"/>
         </w:rPr>
-        <w:t>The system has 22 tables. All tables, keys, and relationships are defined in schema.dbml and drawn as an E-R diagram on dbdiagram.io. The main relationships are:</w:t>
+        <w:t>The system has 11 related tables. All tables, keys and relationships are defined in schema.dbml and drawn as an E-R diagram on dbdiagram.io. Main relationships:</w:t>
       </w:r>
     </w:p>
     <w:tbl>
@@ -214,7 +196,48 @@
               <w:rPr>
                 <w:sz w:val="18"/>
               </w:rPr>
-              <w:t>users - profiles</w:t>
+              <w:t>users - subscriptions - subscription_plans</w:t>
+            </w:r>
+          </w:p>
+        </w:tc>
+        <w:tc>
+          <w:tcPr>
+            <w:tcW w:type="dxa" w:w="3408"/>
+          </w:tcPr>
+          <w:p>
+            <w:r>
+              <w:rPr>
+                <w:sz w:val="18"/>
+              </w:rPr>
+              <w:t>1 : N : 1</w:t>
+            </w:r>
+          </w:p>
+        </w:tc>
+        <w:tc>
+          <w:tcPr>
+            <w:tcW w:type="dxa" w:w="3408"/>
+          </w:tcPr>
+          <w:p>
+            <w:r>
+              <w:rPr>
+                <w:sz w:val="18"/>
+              </w:rPr>
+              <w:t>A user has a subscription on a plan</w:t>
+            </w:r>
+          </w:p>
+        </w:tc>
+      </w:tr>
+      <w:tr>
+        <w:tc>
+          <w:tcPr>
+            <w:tcW w:type="dxa" w:w="3408"/>
+          </w:tcPr>
+          <w:p>
+            <w:r>
+              <w:rPr>
+                <w:sz w:val="18"/>
+              </w:rPr>
+              <w:t>users - reviews / favorites / watch_history</w:t>
             </w:r>
           </w:p>
         </w:tc>
@@ -240,7 +263,7 @@
               <w:rPr>
                 <w:sz w:val="18"/>
               </w:rPr>
-              <w:t>One account, many profiles</w:t>
+              <w:t>User activity</w:t>
             </w:r>
           </w:p>
         </w:tc>
@@ -255,7 +278,7 @@
               <w:rPr>
                 <w:sz w:val="18"/>
               </w:rPr>
-              <w:t>users - subscriptions - payments</w:t>
+              <w:t>content - reviews / favorites / watch_history</w:t>
             </w:r>
           </w:p>
         </w:tc>
@@ -268,7 +291,7 @@
               <w:rPr>
                 <w:sz w:val="18"/>
               </w:rPr>
-              <w:t>1 : N : N</w:t>
+              <w:t>1 : N</w:t>
             </w:r>
           </w:p>
         </w:tc>
@@ -281,89 +304,7 @@
               <w:rPr>
                 <w:sz w:val="18"/>
               </w:rPr>
-              <w:t>Subscription and payment chain</w:t>
-            </w:r>
-          </w:p>
-        </w:tc>
-      </w:tr>
-      <w:tr>
-        <w:tc>
-          <w:tcPr>
-            <w:tcW w:type="dxa" w:w="3408"/>
-          </w:tcPr>
-          <w:p>
-            <w:r>
-              <w:rPr>
-                <w:sz w:val="18"/>
-              </w:rPr>
-              <w:t>content - movies / series</w:t>
-            </w:r>
-          </w:p>
-        </w:tc>
-        <w:tc>
-          <w:tcPr>
-            <w:tcW w:type="dxa" w:w="3408"/>
-          </w:tcPr>
-          <w:p>
-            <w:r>
-              <w:rPr>
-                <w:sz w:val="18"/>
-              </w:rPr>
-              <w:t>1 : 1</w:t>
-            </w:r>
-          </w:p>
-        </w:tc>
-        <w:tc>
-          <w:tcPr>
-            <w:tcW w:type="dxa" w:w="3408"/>
-          </w:tcPr>
-          <w:p>
-            <w:r>
-              <w:rPr>
-                <w:sz w:val="18"/>
-              </w:rPr>
-              <w:t>Supertype / subtype split</w:t>
-            </w:r>
-          </w:p>
-        </w:tc>
-      </w:tr>
-      <w:tr>
-        <w:tc>
-          <w:tcPr>
-            <w:tcW w:type="dxa" w:w="3408"/>
-          </w:tcPr>
-          <w:p>
-            <w:r>
-              <w:rPr>
-                <w:sz w:val="18"/>
-              </w:rPr>
-              <w:t>series - seasons - episodes</w:t>
-            </w:r>
-          </w:p>
-        </w:tc>
-        <w:tc>
-          <w:tcPr>
-            <w:tcW w:type="dxa" w:w="3408"/>
-          </w:tcPr>
-          <w:p>
-            <w:r>
-              <w:rPr>
-                <w:sz w:val="18"/>
-              </w:rPr>
-              <w:t>1 : N : N</w:t>
-            </w:r>
-          </w:p>
-        </w:tc>
-        <w:tc>
-          <w:tcPr>
-            <w:tcW w:type="dxa" w:w="3408"/>
-          </w:tcPr>
-          <w:p>
-            <w:r>
-              <w:rPr>
-                <w:sz w:val="18"/>
-              </w:rPr>
-              <w:t>Series hierarchy</w:t>
+              <w:t>Activity on a title</w:t>
             </w:r>
           </w:p>
         </w:tc>
@@ -404,7 +345,7 @@
               <w:rPr>
                 <w:sz w:val="18"/>
               </w:rPr>
-              <w:t>via content_genres</w:t>
+              <w:t>via content_genres (junction table)</w:t>
             </w:r>
           </w:p>
         </w:tc>
@@ -445,48 +386,7 @@
               <w:rPr>
                 <w:sz w:val="18"/>
               </w:rPr>
-              <w:t>via content_cast (with role)</w:t>
-            </w:r>
-          </w:p>
-        </w:tc>
-      </w:tr>
-      <w:tr>
-        <w:tc>
-          <w:tcPr>
-            <w:tcW w:type="dxa" w:w="3408"/>
-          </w:tcPr>
-          <w:p>
-            <w:r>
-              <w:rPr>
-                <w:sz w:val="18"/>
-              </w:rPr>
-              <w:t>profiles - content</w:t>
-            </w:r>
-          </w:p>
-        </w:tc>
-        <w:tc>
-          <w:tcPr>
-            <w:tcW w:type="dxa" w:w="3408"/>
-          </w:tcPr>
-          <w:p>
-            <w:r>
-              <w:rPr>
-                <w:sz w:val="18"/>
-              </w:rPr>
-              <w:t>N : M</w:t>
-            </w:r>
-          </w:p>
-        </w:tc>
-        <w:tc>
-          <w:tcPr>
-            <w:tcW w:type="dxa" w:w="3408"/>
-          </w:tcPr>
-          <w:p>
-            <w:r>
-              <w:rPr>
-                <w:sz w:val="18"/>
-              </w:rPr>
-              <w:t>via watchlist, favorites, reviews</w:t>
+              <w:t>via content_cast (junction table, with role)</w:t>
             </w:r>
           </w:p>
         </w:tc>
@@ -525,7 +425,7 @@
           <w:i/>
           <w:sz w:val="19"/>
         </w:rPr>
-        <w:t>Watch(user_email, user_name, country_name, country_code, plan_name, plan_price, title, genres, director, rating)</w:t>
+        <w:t>Watch(user_email, user_name, plan_name, plan_price, title, genres, director, rating)</w:t>
       </w:r>
     </w:p>
     <w:p>
@@ -555,7 +455,7 @@
         <w:t xml:space="preserve">Functional dependencies: </w:t>
       </w:r>
       <w:r>
-        <w:t>user_email -&gt; user_name, country_name; country_name -&gt; country_code; plan_name -&gt; plan_price; content_id -&gt; title, director.</w:t>
+        <w:t>user_email -&gt; user_name; plan_name -&gt; plan_price; content_id -&gt; title, director.</w:t>
       </w:r>
     </w:p>
     <w:p>
@@ -600,7 +500,7 @@
         <w:t xml:space="preserve">3NF: </w:t>
       </w:r>
       <w:r>
-        <w:t>Transitive dependencies are removed: country_name -&gt; country_code goes to countries; plan_price goes to subscription_plans; director goes to people + content_cast.</w:t>
+        <w:t>Transitive dependencies are removed: plan_price (which depends on plan_name, not the key) goes to subscription_plans; director goes to people + content_cast.</w:t>
       </w:r>
     </w:p>
     <w:p>
@@ -611,7 +511,7 @@
         <w:rPr>
           <w:sz w:val="19"/>
         </w:rPr>
-        <w:t>After this, all 22 tables are in 3NF: every non-key column depends fully and directly on its primary key. Most tables are also in BCNF. The decomposition is lossless and dependency preserving.</w:t>
+        <w:t>All 11 tables end up in 3NF: every non-key column depends fully and directly on its primary key. Single attributes such as country and original_language have no further dependency, so they stay as plain columns. The decomposition is lossless and dependency preserving.</w:t>
       </w:r>
     </w:p>
     <w:p>
@@ -650,7 +550,7 @@
         <w:t xml:space="preserve">Primary keys: </w:t>
       </w:r>
       <w:r>
-        <w:t>on every table; composite keys on link tables (e.g. content_genres).</w:t>
+        <w:t>on every table; composite keys on the junction tables content_genres, content_cast and favorites.</w:t>
       </w:r>
     </w:p>
     <w:p>
@@ -665,7 +565,7 @@
         <w:t xml:space="preserve">Foreign keys: </w:t>
       </w:r>
       <w:r>
-        <w:t>on all relationships, with ON DELETE CASCADE where it makes sense (deleting a user also removes their profiles, subscriptions and devices).</w:t>
+        <w:t>on all relationships, with ON DELETE CASCADE where it makes sense (deleting a user also removes their subscription, reviews, favorites and history).</w:t>
       </w:r>
     </w:p>
     <w:p>
@@ -680,7 +580,7 @@
         <w:t xml:space="preserve">UNIQUE: </w:t>
       </w:r>
       <w:r>
-        <w:t>users.email, genres.genre_name, and reviews(profile_id, content_id) so a profile reviews a title once.</w:t>
+        <w:t>users.email, genres.genre_name, and reviews(user_id, content_id) so a user reviews a title once.</w:t>
       </w:r>
     </w:p>
     <w:p>
@@ -709,7 +609,7 @@
         <w:t xml:space="preserve">Sample data: </w:t>
       </w:r>
       <w:r>
-        <w:t>02_sample_data.sql loads 426 rows across the 22 tables (15 users, 26 profiles, 20 titles, 32 episodes, 28 history rows, 20 reviews, and so on). All rows load cleanly with foreign key checks on.</w:t>
+        <w:t>02_sample_data.sql loads about 228 rows across the 11 tables (15 users, 20 titles, 20 people, 32 cast rows, 52 genre links, 25 history rows, 20 reviews, 16 favorites). All rows load cleanly with foreign key checks on.</w:t>
       </w:r>
     </w:p>
     <w:p>
@@ -748,7 +648,7 @@
         <w:t xml:space="preserve">03_dml_operations.sql: </w:t>
       </w:r>
       <w:r>
-        <w:t>14 statements - 5 INSERT, 5 UPDATE, 4 DELETE (new signup, subscription, profile, plan downgrade, expiring subscriptions, account deletion with cascade, and more).</w:t>
+        <w:t>14 statements - 5 INSERT, 5 UPDATE, 4 DELETE (new signup, subscription, favorite, review, plan downgrade, expiring subscriptions, account deletion with cascade, and more).</w:t>
       </w:r>
     </w:p>
     <w:p>
@@ -763,7 +663,7 @@
         <w:t xml:space="preserve">04_queries.sql: </w:t>
       </w:r>
       <w:r>
-        <w:t>5 simple queries (filtering and sorting) and 7 complex ones using JOIN, GROUP BY / HAVING, and subqueries: average rating per title, busiest genres, total paid per user, titles above the average rating, titles never watched, top 5 favorites, and titles by a given director.</w:t>
+        <w:t>5 simple queries (filtering and sorting) and 7 complex ones using JOIN, GROUP BY / HAVING and subqueries: average rating per title, busiest genres, monthly revenue per plan, titles above the average rating, titles never watched, top 5 favorites, and titles by a given director.</w:t>
       </w:r>
     </w:p>
     <w:p>

</xml_diff>

<commit_message>
Rename project STREAMFLIX -> VIEWFLIX everywhere (db name, files, report, repo)
</commit_message>
<xml_diff>
--- a/report.docx
+++ b/report.docx
@@ -12,7 +12,7 @@
           <w:color w:val="1F3864"/>
           <w:sz w:val="30"/>
         </w:rPr>
-        <w:t>STREAMFLIX - Movie &amp; Series Streaming Platform Database</w:t>
+        <w:t>VIEWFLIX - Movie &amp; Series Streaming Platform Database</w:t>
       </w:r>
     </w:p>
     <w:p>
@@ -59,7 +59,7 @@
         <w:rPr>
           <w:sz w:val="20"/>
         </w:rPr>
-        <w:t>STREAMFLIX is the database for a movie and series streaming service like Netflix. Users sign up with their own details, log in, and watch films and series. They can mark favorites, keep a watch history, and rate or review titles. We only built the database layer; there is no web or mobile app. Main requirements:</w:t>
+        <w:t>VIEWFLIX is the database for a movie and series streaming service like Netflix. Users sign up with their own details, log in, and watch films and series. They can mark favorites, keep a watch history, and rate or review titles. We only built the database layer; there is no web or mobile app. Main requirements:</w:t>
       </w:r>
     </w:p>
     <w:p>

</xml_diff>

<commit_message>
Queries: restructure into 5 simple + 5 complex + 5 aggregation (15 total); update report
</commit_message>
<xml_diff>
--- a/report.docx
+++ b/report.docx
@@ -663,7 +663,7 @@
         <w:t xml:space="preserve">04_queries.sql: </w:t>
       </w:r>
       <w:r>
-        <w:t>5 simple queries (filtering and sorting) and 7 complex ones using JOIN, GROUP BY / HAVING and subqueries: average rating per title, busiest genres, monthly revenue per plan, titles above the average rating, titles never watched, top 5 favorites, and titles by a given director.</w:t>
+        <w:t>15 queries in three groups - 5 simple (filtering and sorting), 5 complex (JOIN and subquery: titles above the average rating, titles never watched, reviews joined to users and titles, a director's filmography), and 5 aggregation (GROUP BY / HAVING: average rating per title, busiest genres, monthly revenue per plan, top 5 favorites).</w:t>
       </w:r>
     </w:p>
     <w:p>
@@ -674,7 +674,7 @@
         <w:t xml:space="preserve">Testing and demo: </w:t>
       </w:r>
       <w:r>
-        <w:t>All files (schema, data, DML and the 12 queries) were run on a real MySQL 8.4 server with no errors. The live demo runs in MySQL Workbench in order 01 to 04; the E-R diagram is shown on dbdiagram.io from schema.dbml.</w:t>
+        <w:t>All files (schema, data, DML and the 15 queries) were run on a real MySQL 8.4 server with no errors. The live demo runs in MySQL Workbench in order 01 to 04; the E-R diagram is shown on dbdiagram.io from schema.dbml.</w:t>
       </w:r>
     </w:p>
     <w:sectPr>

</xml_diff>

<commit_message>
Add Chen-notation E-R diagram (Graphviz) and embed it in the report
</commit_message>
<xml_diff>
--- a/report.docx
+++ b/report.docx
@@ -128,7 +128,7 @@
         <w:rPr>
           <w:sz w:val="20"/>
         </w:rPr>
-        <w:t>The system has 11 related tables. All tables, keys and relationships are defined in schema.dbml and drawn as an E-R diagram on dbdiagram.io. Main relationships:</w:t>
+        <w:t>The system has 11 related tables. The E-R diagram (Chen notation) is shown in Figure 1 at the end of this report; the same model is also kept as schema.dbml for dbdiagram.io. Main relationships:</w:t>
       </w:r>
     </w:p>
     <w:tbl>
@@ -674,7 +674,76 @@
         <w:t xml:space="preserve">Testing and demo: </w:t>
       </w:r>
       <w:r>
-        <w:t>All files (schema, data, DML and the 15 queries) were run on a real MySQL 8.4 server with no errors. The live demo runs in MySQL Workbench in order 01 to 04; the E-R diagram is shown on dbdiagram.io from schema.dbml.</w:t>
+        <w:t>All files (schema, data, DML and the 15 queries) were run on a real MySQL 8.4 server with no errors. The live demo runs in MySQL Workbench in order 01 to 04.</w:t>
+      </w:r>
+    </w:p>
+    <w:p>
+      <w:r>
+        <w:br w:type="page"/>
+      </w:r>
+    </w:p>
+    <w:p>
+      <w:pPr>
+        <w:pStyle w:val="Heading1"/>
+        <w:spacing w:before="80" w:after="40"/>
+      </w:pPr>
+      <w:r>
+        <w:rPr>
+          <w:color w:val="1F3864"/>
+          <w:sz w:val="25"/>
+        </w:rPr>
+        <w:t>Figure 1 - E-R Diagram (Chen Notation)</w:t>
+      </w:r>
+    </w:p>
+    <w:p>
+      <w:pPr>
+        <w:jc w:val="center"/>
+      </w:pPr>
+      <w:r>
+        <w:drawing>
+          <wp:inline xmlns:a="http://schemas.openxmlformats.org/drawingml/2006/main" xmlns:pic="http://schemas.openxmlformats.org/drawingml/2006/picture">
+            <wp:extent cx="5120640" cy="6486582"/>
+            <wp:docPr id="1" name="Picture 1"/>
+            <wp:cNvGraphicFramePr>
+              <a:graphicFrameLocks noChangeAspect="1"/>
+            </wp:cNvGraphicFramePr>
+            <a:graphic>
+              <a:graphicData uri="http://schemas.openxmlformats.org/drawingml/2006/picture">
+                <pic:pic>
+                  <pic:nvPicPr>
+                    <pic:cNvPr id="0" name="er_diagram.png"/>
+                    <pic:cNvPicPr/>
+                  </pic:nvPicPr>
+                  <pic:blipFill>
+                    <a:blip r:embed="rId9"/>
+                    <a:stretch>
+                      <a:fillRect/>
+                    </a:stretch>
+                  </pic:blipFill>
+                  <pic:spPr>
+                    <a:xfrm>
+                      <a:off x="0" y="0"/>
+                      <a:ext cx="5120640" cy="6486582"/>
+                    </a:xfrm>
+                    <a:prstGeom prst="rect"/>
+                  </pic:spPr>
+                </pic:pic>
+              </a:graphicData>
+            </a:graphic>
+          </wp:inline>
+        </w:drawing>
+      </w:r>
+    </w:p>
+    <w:p>
+      <w:pPr>
+        <w:jc w:val="center"/>
+      </w:pPr>
+      <w:r>
+        <w:rPr>
+          <w:i/>
+          <w:sz w:val="17"/>
+        </w:rPr>
+        <w:t>Entities (rectangles), attributes (ellipses, primary keys underlined), relationships (diamonds), with cardinalities (1, N, M).</w:t>
       </w:r>
     </w:p>
     <w:sectPr>

</xml_diff>

<commit_message>
Bigger, more readable ER diagram; re-embed in report
</commit_message>
<xml_diff>
--- a/report.docx
+++ b/report.docx
@@ -9,6 +9,7 @@
       <w:r>
         <w:rPr>
           <w:b/>
+          <w:i w:val="0"/>
           <w:color w:val="1F3864"/>
           <w:sz w:val="30"/>
         </w:rPr>
@@ -21,6 +22,7 @@
       </w:pPr>
       <w:r>
         <w:rPr>
+          <w:b w:val="0"/>
           <w:i/>
           <w:sz w:val="21"/>
         </w:rPr>
@@ -33,6 +35,8 @@
       </w:pPr>
       <w:r>
         <w:rPr>
+          <w:b w:val="0"/>
+          <w:i w:val="0"/>
           <w:sz w:val="19"/>
         </w:rPr>
         <w:t>Team: Goktug Karaca, Defne Kaya    Date: 29 May 2026</w:t>
@@ -702,7 +706,7 @@
       <w:r>
         <w:drawing>
           <wp:inline xmlns:a="http://schemas.openxmlformats.org/drawingml/2006/main" xmlns:pic="http://schemas.openxmlformats.org/drawingml/2006/picture">
-            <wp:extent cx="5120640" cy="6486582"/>
+            <wp:extent cx="5303520" cy="6829713"/>
             <wp:docPr id="1" name="Picture 1"/>
             <wp:cNvGraphicFramePr>
               <a:graphicFrameLocks noChangeAspect="1"/>
@@ -723,7 +727,7 @@
                   <pic:spPr>
                     <a:xfrm>
                       <a:off x="0" y="0"/>
-                      <a:ext cx="5120640" cy="6486582"/>
+                      <a:ext cx="5303520" cy="6829713"/>
                     </a:xfrm>
                     <a:prstGeom prst="rect"/>
                   </pic:spPr>

</xml_diff>